<commit_message>
Fix bugs and Add new features v2.0
Fixed bugs and Improvements:
- Restructure code and logic
- Enhance UI experience
- Now marksheets won't be generated for empty sheets
- Generate Marksheets button will be disabled while work in progress
- Language switch is disabled while work in progress for now
- Known errors like missing excel file and template file are handled
- Unknown errors are also handled and logged by implementing try-catch blocks

Newly added features:
- Add proper log feature
- Add Hindi language support for UI
- Add output type feature i.e. Single and Separate PDFs
- Add Evaluation term and year feature to remove manual edit of templates
- Show 'status' on status bar i.e. ready or work in progress

Note:
- Currently, utils.py contains all the shared logic, e.g. path, log, language
</commit_message>
<xml_diff>
--- a/templates/marksheet-format-12345.docx
+++ b/templates/marksheet-format-12345.docx
@@ -13,8 +13,6 @@
           <w:szCs w:val="54"/>
         </w:rPr>
       </w:pPr>
-      <w:bookmarkStart w:id="0" w:name="_GoBack"/>
-      <w:bookmarkEnd w:id="0"/>
       <w:r>
         <w:rPr>
           <w:rFonts w:ascii="Copperplate Gothic Bold" w:hAnsi="Copperplate Gothic Bold" w:cs="Times New Roman"/>
@@ -137,10 +135,10 @@
                   <wp:posOffset>2886075</wp:posOffset>
                 </wp:positionH>
                 <wp:positionV relativeFrom="paragraph">
-                  <wp:posOffset>223256</wp:posOffset>
+                  <wp:posOffset>228600</wp:posOffset>
                 </wp:positionV>
-                <wp:extent cx="4010025" cy="303530"/>
-                <wp:effectExtent l="38100" t="0" r="28575" b="58420"/>
+                <wp:extent cx="4010025" cy="367271"/>
+                <wp:effectExtent l="38100" t="0" r="28575" b="52070"/>
                 <wp:wrapNone/>
                 <wp:docPr id="3" name="Flowchart: Alternate Process 5"/>
                 <wp:cNvGraphicFramePr>
@@ -155,7 +153,7 @@
                       <wps:spPr bwMode="auto">
                         <a:xfrm>
                           <a:off x="0" y="0"/>
-                          <a:ext cx="4010025" cy="303530"/>
+                          <a:ext cx="4010025" cy="367271"/>
                         </a:xfrm>
                         <a:prstGeom prst="rect">
                           <a:avLst/>
@@ -202,7 +200,7 @@
           </mc:Choice>
           <mc:Fallback>
             <w:pict>
-              <v:rect id="Flowchart: Alternate Process 5" o:spid="_x0000_s1026" style="position:absolute;margin-left:227.25pt;margin-top:17.6pt;width:315.75pt;height:23.9pt;z-index:-251656192;visibility:visible;mso-wrap-style:square;mso-width-percent:0;mso-height-percent:0;mso-wrap-distance-left:9pt;mso-wrap-distance-top:0;mso-wrap-distance-right:9pt;mso-wrap-distance-bottom:0;mso-position-horizontal:absolute;mso-position-horizontal-relative:text;mso-position-vertical:absolute;mso-position-vertical-relative:text;mso-width-percent:0;mso-height-percent:0;mso-width-relative:margin;mso-height-relative:margin;v-text-anchor:middle" o:gfxdata="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" fillcolor="white [3201]" strokecolor="black [3213]" strokeweight="1pt">
+              <v:rect id="Flowchart: Alternate Process 5" o:spid="_x0000_s1026" style="position:absolute;margin-left:227.25pt;margin-top:18pt;width:315.75pt;height:28.9pt;z-index:-251656192;visibility:visible;mso-wrap-style:square;mso-width-percent:0;mso-height-percent:0;mso-wrap-distance-left:9pt;mso-wrap-distance-top:0;mso-wrap-distance-right:9pt;mso-wrap-distance-bottom:0;mso-position-horizontal:absolute;mso-position-horizontal-relative:text;mso-position-vertical:absolute;mso-position-vertical-relative:text;mso-width-percent:0;mso-height-percent:0;mso-width-relative:margin;mso-height-relative:margin;v-text-anchor:middle" o:gfxdata="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" fillcolor="white [3201]" strokecolor="black [3213]" strokeweight="1pt">
                 <v:shadow on="t" color="black" opacity="26213f" origin=".5,-.5" offset="-.74836mm,.74836mm"/>
               </v:rect>
             </w:pict>
@@ -266,7 +264,6 @@
           <w:szCs w:val="40"/>
         </w:rPr>
         <w:tab/>
-        <w:t>Final Evaluation Sheet - 2026</w:t>
       </w:r>
     </w:p>
     <w:p>
@@ -1402,7 +1399,15 @@
                 <w:sz w:val="28"/>
                 <w:szCs w:val="40"/>
               </w:rPr>
-              <w:t>Nepali Theoretical</w:t>
+              <w:t>Hindi</w:t>
+            </w:r>
+            <w:r>
+              <w:rPr>
+                <w:rFonts w:ascii="Times New Roman" w:hAnsi="Times New Roman" w:cs="Times New Roman"/>
+                <w:sz w:val="28"/>
+                <w:szCs w:val="40"/>
+              </w:rPr>
+              <w:t xml:space="preserve"> Theoretical</w:t>
             </w:r>
           </w:p>
         </w:tc>
@@ -1647,7 +1652,25 @@
                 <w:sz w:val="28"/>
                 <w:szCs w:val="40"/>
               </w:rPr>
-              <w:t>Nepali Oral</w:t>
+              <w:t>Hindi</w:t>
+            </w:r>
+            <w:r>
+              <w:rPr>
+                <w:rFonts w:ascii="Times New Roman" w:hAnsi="Times New Roman" w:cs="Times New Roman"/>
+                <w:sz w:val="28"/>
+                <w:szCs w:val="40"/>
+              </w:rPr>
+              <w:t xml:space="preserve"> </w:t>
+            </w:r>
+            <w:bookmarkStart w:id="0" w:name="_GoBack"/>
+            <w:bookmarkEnd w:id="0"/>
+            <w:r>
+              <w:rPr>
+                <w:rFonts w:ascii="Times New Roman" w:hAnsi="Times New Roman" w:cs="Times New Roman"/>
+                <w:sz w:val="28"/>
+                <w:szCs w:val="40"/>
+              </w:rPr>
+              <w:t>Oral</w:t>
             </w:r>
           </w:p>
         </w:tc>

</xml_diff>